<commit_message>
Add Gleaming Slots and Jackpot Dance entries; split Gleaming Slots out of Jackpot Go block
</commit_message>
<xml_diff>
--- a/Recommended Casinos/Recommended-List.docx
+++ b/Recommended Casinos/Recommended-List.docx
@@ -2266,53 +2266,122 @@
     </w:p>
     <w:p>
       <w:pPr>
+        <w:spacing w:after="75"/>
+        <w:ind w:left="-5"/>
+      </w:pPr>
+      <w:hyperlink r:id="rId39">
+        <w:r>
+          <w:rPr>
+            <w:b/>
+            <w:color w:val="0056B3"/>
+            <w:sz w:val="24"/>
+            <w:u w:val="single" w:color="0056B3"/>
+          </w:rPr>
+          <w:t>Gleaming Slots</w:t>
+        </w:r>
+      </w:hyperlink>
+      <w:r>
+        <w:rPr>
+          <w:b/>
+          <w:color w:val="0056B3"/>
+          <w:sz w:val="24"/>
+        </w:rPr>
+        <w:t xml:space="preserve"> </w:t>
+      </w:r>
+    </w:p>
+    <w:p>
+      <w:pPr>
         <w:numPr>
           <w:ilvl w:val="0"/>
           <w:numId w:val="3"/>
         </w:numPr>
-        <w:spacing w:after="159" w:line="371" w:lineRule="auto"/>
-        <w:ind w:firstLine="360"/>
-      </w:pPr>
-      <w:r>
-        <w:t xml:space="preserve">1 day redemption </w:t>
-      </w:r>
-      <w:hyperlink r:id="rId39">
-        <w:r>
-          <w:rPr>
-            <w:b/>
-            <w:color w:val="1155CC"/>
-            <w:sz w:val="26"/>
-            <w:u w:val="single" w:color="1155CC"/>
-          </w:rPr>
-          <w:t>Gleaming</w:t>
-        </w:r>
-      </w:hyperlink>
-      <w:hyperlink r:id="rId40">
-        <w:r>
-          <w:rPr>
-            <w:b/>
-            <w:color w:val="1155CC"/>
-            <w:sz w:val="26"/>
-            <w:u w:val="single" w:color="1155CC"/>
-          </w:rPr>
-          <w:t xml:space="preserve"> </w:t>
-        </w:r>
-      </w:hyperlink>
-      <w:hyperlink r:id="rId41">
-        <w:r>
-          <w:rPr>
-            <w:b/>
-            <w:color w:val="1155CC"/>
-            <w:sz w:val="26"/>
-            <w:u w:val="single" w:color="1155CC"/>
-          </w:rPr>
-          <w:t>Slots</w:t>
+        <w:ind w:hanging="360"/>
+      </w:pPr>
+      <w:r>
+        <w:t xml:space="preserve">2 SC free + free wheel spin on signup (verify to claim) </w:t>
+      </w:r>
+    </w:p>
+    <w:p>
+      <w:pPr>
+        <w:numPr>
+          <w:ilvl w:val="0"/>
+          <w:numId w:val="3"/>
+        </w:numPr>
+        <w:ind w:hanging="360"/>
+      </w:pPr>
+      <w:r>
+        <w:t xml:space="preserve">$1 minimum withdrawal </w:t>
+      </w:r>
+    </w:p>
+    <w:p>
+      <w:pPr>
+        <w:numPr>
+          <w:ilvl w:val="0"/>
+          <w:numId w:val="3"/>
+        </w:numPr>
+        <w:ind w:hanging="360"/>
+      </w:pPr>
+      <w:r>
+        <w:t xml:space="preserve">Same day / 24 hour withdrawals </w:t>
+      </w:r>
+    </w:p>
+    <w:p>
+      <w:pPr>
+        <w:numPr>
+          <w:ilvl w:val="0"/>
+          <w:numId w:val="3"/>
+        </w:numPr>
+        <w:ind w:hanging="360"/>
+      </w:pPr>
+      <w:r>
+        <w:t xml:space="preserve">Daily login bonuses + challenges/missions </w:t>
+      </w:r>
+    </w:p>
+    <w:p>
+      <w:pPr>
+        <w:numPr>
+          <w:ilvl w:val="0"/>
+          <w:numId w:val="3"/>
+        </w:numPr>
+        <w:ind w:hanging="360"/>
+      </w:pPr>
+      <w:r>
+        <w:t xml:space="preserve">Tournaments with prize pools up to 2,500 SC </w:t>
+      </w:r>
+    </w:p>
+    <w:p>
+      <w:pPr>
+        <w:numPr>
+          <w:ilvl w:val="0"/>
+          <w:numId w:val="3"/>
+        </w:numPr>
+        <w:ind w:hanging="360"/>
+      </w:pPr>
+      <w:r>
+        <w:t xml:space="preserve">500+ casino-style games </w:t>
+      </w:r>
+    </w:p>
+    <w:p>
+      <w:pPr>
+        <w:spacing w:after="75"/>
+        <w:ind w:left="-5"/>
+      </w:pPr>
+      <w:hyperlink r:id="rId109">
+        <w:r>
+          <w:rPr>
+            <w:b/>
+            <w:color w:val="0056B3"/>
+            <w:sz w:val="24"/>
+            <w:u w:val="single" w:color="0056B3"/>
+          </w:rPr>
+          <w:t>Jackpot Dance</w:t>
         </w:r>
       </w:hyperlink>
       <w:r>
         <w:rPr>
           <w:b/>
-          <w:sz w:val="26"/>
+          <w:color w:val="0056B3"/>
+          <w:sz w:val="24"/>
         </w:rPr>
         <w:t xml:space="preserve"> </w:t>
       </w:r>
@@ -2323,14 +2392,10 @@
           <w:ilvl w:val="0"/>
           <w:numId w:val="3"/>
         </w:numPr>
-        <w:spacing w:after="51" w:line="265" w:lineRule="auto"/>
-        <w:ind w:firstLine="360"/>
-      </w:pPr>
-      <w:r>
-        <w:rPr>
-          <w:sz w:val="22"/>
-        </w:rPr>
-        <w:t xml:space="preserve">Wheel Spin </w:t>
+        <w:ind w:hanging="360"/>
+      </w:pPr>
+      <w:r>
+        <w:t xml:space="preserve">Free wheel spin on signup (use code TV6ML40G) </w:t>
       </w:r>
     </w:p>
     <w:p>
@@ -2339,14 +2404,10 @@
           <w:ilvl w:val="0"/>
           <w:numId w:val="3"/>
         </w:numPr>
-        <w:spacing w:after="51" w:line="265" w:lineRule="auto"/>
-        <w:ind w:firstLine="360"/>
-      </w:pPr>
-      <w:r>
-        <w:rPr>
-          <w:sz w:val="22"/>
-        </w:rPr>
-        <w:t xml:space="preserve">$1 min redemption </w:t>
+        <w:ind w:hanging="360"/>
+      </w:pPr>
+      <w:r>
+        <w:t xml:space="preserve">Same-day redemption, $1 minimum </w:t>
       </w:r>
     </w:p>
     <w:p>
@@ -2355,14 +2416,58 @@
           <w:ilvl w:val="0"/>
           <w:numId w:val="3"/>
         </w:numPr>
-        <w:spacing w:after="370" w:line="265" w:lineRule="auto"/>
-        <w:ind w:firstLine="360"/>
-      </w:pPr>
-      <w:r>
-        <w:rPr>
-          <w:sz w:val="22"/>
-        </w:rPr>
-        <w:t xml:space="preserve">1 day redemption </w:t>
+        <w:ind w:hanging="360"/>
+      </w:pPr>
+      <w:r>
+        <w:t xml:space="preserve">1x playthrough before redemption </w:t>
+      </w:r>
+    </w:p>
+    <w:p>
+      <w:pPr>
+        <w:numPr>
+          <w:ilvl w:val="0"/>
+          <w:numId w:val="3"/>
+        </w:numPr>
+        <w:ind w:hanging="360"/>
+      </w:pPr>
+      <w:r>
+        <w:t xml:space="preserve">Daily rewards and promotions </w:t>
+      </w:r>
+    </w:p>
+    <w:p>
+      <w:pPr>
+        <w:numPr>
+          <w:ilvl w:val="0"/>
+          <w:numId w:val="3"/>
+        </w:numPr>
+        <w:ind w:hanging="360"/>
+      </w:pPr>
+      <w:r>
+        <w:t xml:space="preserve">500+ casino-style games </w:t>
+      </w:r>
+    </w:p>
+    <w:p>
+      <w:pPr>
+        <w:numPr>
+          <w:ilvl w:val="0"/>
+          <w:numId w:val="3"/>
+        </w:numPr>
+        <w:ind w:hanging="360"/>
+      </w:pPr>
+      <w:r>
+        <w:t xml:space="preserve">Web, Android and iOS </w:t>
+      </w:r>
+    </w:p>
+    <w:p>
+      <w:pPr>
+        <w:numPr>
+          <w:ilvl w:val="0"/>
+          <w:numId w:val="3"/>
+        </w:numPr>
+        <w:ind w:hanging="360"/>
+      </w:pPr>
+      <w:r>
+        <w:t xml:space="preserve">KYC required to redeem - verify right after signup </w:t>
       </w:r>
     </w:p>
     <w:p>

</xml_diff>

<commit_message>
Fix list nesting, restore inline hyperlinks (Sweeps Jungle, Bitsky FAQ), convert hand-indented bullets to real sub-lists
</commit_message>
<xml_diff>
--- a/Recommended Casinos/Recommended-List.docx
+++ b/Recommended Casinos/Recommended-List.docx
@@ -1632,70 +1632,37 @@
     </w:p>
     <w:p>
       <w:pPr>
-        <w:tabs>
-          <w:tab w:val="center" w:pos="1140"/>
-          <w:tab w:val="center" w:pos="2051"/>
-        </w:tabs>
-        <w:ind w:left="0" w:firstLine="0"/>
-      </w:pPr>
-      <w:r>
-        <w:rPr>
-          <w:rFonts w:ascii="Calibri" w:eastAsia="Calibri" w:hAnsi="Calibri" w:cs="Calibri"/>
-          <w:sz w:val="22"/>
-        </w:rPr>
-        <w:tab/>
-      </w:r>
-      <w:r>
-        <w:t xml:space="preserve">○ </w:t>
-      </w:r>
-      <w:r>
-        <w:tab/>
+        <w:numPr>
+          <w:ilvl w:val="1"/>
+          <w:numId w:val="2"/>
+        </w:numPr>
+        <w:ind w:left="1080" w:hanging="360"/>
+      </w:pPr>
+      <w:r>
         <w:t xml:space="preserve">FPCODETG1 </w:t>
       </w:r>
     </w:p>
     <w:p>
       <w:pPr>
-        <w:tabs>
-          <w:tab w:val="center" w:pos="1140"/>
-          <w:tab w:val="center" w:pos="2057"/>
-        </w:tabs>
-        <w:ind w:left="0" w:firstLine="0"/>
-      </w:pPr>
-      <w:r>
-        <w:rPr>
-          <w:rFonts w:ascii="Calibri" w:eastAsia="Calibri" w:hAnsi="Calibri" w:cs="Calibri"/>
-          <w:sz w:val="22"/>
-        </w:rPr>
-        <w:tab/>
-      </w:r>
-      <w:r>
-        <w:t xml:space="preserve">○ </w:t>
-      </w:r>
-      <w:r>
-        <w:tab/>
+        <w:numPr>
+          <w:ilvl w:val="1"/>
+          <w:numId w:val="2"/>
+        </w:numPr>
+        <w:ind w:left="1080" w:hanging="360"/>
+      </w:pPr>
+      <w:r>
         <w:t xml:space="preserve">FPCODEDC1 </w:t>
       </w:r>
     </w:p>
     <w:p>
       <w:pPr>
-        <w:tabs>
-          <w:tab w:val="center" w:pos="1140"/>
-          <w:tab w:val="center" w:pos="2095"/>
-        </w:tabs>
-        <w:ind w:left="0" w:firstLine="0"/>
-      </w:pPr>
-      <w:r>
-        <w:rPr>
-          <w:rFonts w:ascii="Calibri" w:eastAsia="Calibri" w:hAnsi="Calibri" w:cs="Calibri"/>
-          <w:sz w:val="22"/>
-        </w:rPr>
-        <w:tab/>
-      </w:r>
-      <w:r>
-        <w:t xml:space="preserve">○ </w:t>
-      </w:r>
-      <w:r>
-        <w:tab/>
+        <w:numPr>
+          <w:ilvl w:val="1"/>
+          <w:numId w:val="2"/>
+        </w:numPr>
+        <w:ind w:left="1080" w:hanging="360"/>
+      </w:pPr>
+      <w:r>
         <w:t xml:space="preserve">FPCODEFB66 </w:t>
       </w:r>
     </w:p>
@@ -2704,25 +2671,13 @@
     </w:p>
     <w:p>
       <w:pPr>
-        <w:tabs>
-          <w:tab w:val="center" w:pos="1140"/>
-          <w:tab w:val="center" w:pos="3079"/>
-        </w:tabs>
-        <w:spacing w:after="276"/>
-        <w:ind w:left="0" w:firstLine="0"/>
-      </w:pPr>
-      <w:r>
-        <w:rPr>
-          <w:rFonts w:ascii="Calibri" w:eastAsia="Calibri" w:hAnsi="Calibri" w:cs="Calibri"/>
-          <w:sz w:val="22"/>
-        </w:rPr>
-        <w:tab/>
-      </w:r>
-      <w:r>
-        <w:t xml:space="preserve">○ </w:t>
-      </w:r>
-      <w:r>
-        <w:tab/>
+        <w:numPr>
+          <w:ilvl w:val="1"/>
+          <w:numId w:val="3"/>
+        </w:numPr>
+        <w:ind w:left="1080" w:hanging="360"/>
+      </w:pPr>
+      <w:r>
         <w:t xml:space="preserve">withdraw from platform minimum $50 </w:t>
       </w:r>
     </w:p>

</xml_diff>